<commit_message>
Day 11: Improved DOCX report with dynamic scan info, findings table, summary, conclusion and future enhancements
</commit_message>
<xml_diff>
--- a/sentinal/research/report/output/SentinelAI_Report.docx
+++ b/sentinal/research/report/output/SentinelAI_Report.docx
@@ -37,7 +37,7 @@
     </w:p>
     <w:p>
       <w:r>
-        <w:t>Date: July 19, 2026</w:t>
+        <w:t>Date: 02 August 2026, 11:12 AM</w:t>
       </w:r>
     </w:p>
     <w:p>
@@ -281,7 +281,50 @@
     </w:p>
     <w:p>
       <w:r>
-        <w:t>This is a static sample report generated for development purposes. The findings shown above are hardcoded test data and will later be replaced with actual scan results.</w:t>
+        <w:t>This report presents the results of the security assessment performed on the target system (192.168.1.10) using the Nmap Basic Scan. During the scan, a total of 4 security findings were identified. The assessment detected 0 Critical, 1 High, 1 Medium, and 2 Low severity findings. Based on these results, it is recommended to review the identified services and implement the necessary security updates and remediation measures to reduce potential security risks.</w:t>
+      </w:r>
+    </w:p>
+    <w:p/>
+    <w:p>
+      <w:pPr>
+        <w:pStyle w:val="Heading3"/>
+      </w:pPr>
+      <w:r>
+        <w:t>Severity Statistics</w:t>
+      </w:r>
+    </w:p>
+    <w:p>
+      <w:r>
+        <w:t>• Total Findings: 4</w:t>
+        <w:br/>
+      </w:r>
+      <w:r>
+        <w:t>• Critical Severity: 0</w:t>
+        <w:br/>
+      </w:r>
+      <w:r>
+        <w:t>• High Severity: 1</w:t>
+        <w:br/>
+      </w:r>
+      <w:r>
+        <w:t>• Medium Severity: 1</w:t>
+        <w:br/>
+      </w:r>
+      <w:r>
+        <w:t>• Low Severity: 2</w:t>
+      </w:r>
+    </w:p>
+    <w:p>
+      <w:pPr>
+        <w:pStyle w:val="Heading2"/>
+      </w:pPr>
+      <w:r>
+        <w:t>Conclusion</w:t>
+      </w:r>
+    </w:p>
+    <w:p>
+      <w:r>
+        <w:t>The generated report provides a structured overview of the detected services and their associated security severity levels. Although the current implementation uses sample findings, the reporting engine is now fully dynamic and ready to integrate with real scan results from the SentinelAI scanning modules. This establishes a scalable foundation for automated vulnerability assessment and reporting.</w:t>
       </w:r>
     </w:p>
     <w:p>
@@ -294,17 +337,25 @@
     </w:p>
     <w:p>
       <w:r>
-        <w:t>- Dynamic scan results</w:t>
+        <w:t>• Integration with live Nmap scan results</w:t>
         <w:br/>
-        <w:t>- CVE Lookup Integration</w:t>
+        <w:t>• Automatic CVE lookup using the NVD API</w:t>
         <w:br/>
-        <w:t>- MITRE ATT&amp;CK Mapping</w:t>
+        <w:t>• CVSS-based risk scoring and prioritization</w:t>
         <w:br/>
-        <w:t>- OWASP Mapping</w:t>
+        <w:t>• MITRE ATT&amp;CK framework mapping</w:t>
         <w:br/>
-        <w:t>- AI-generated Explanation</w:t>
+        <w:t>• OWASP Top 10 vulnerability mapping</w:t>
         <w:br/>
-        <w:t>- PDF Report Generation</w:t>
+        <w:t>• AI-generated explanations and remediation suggestions</w:t>
+        <w:br/>
+        <w:t>• Interactive dashboard for scan history and analytics</w:t>
+        <w:br/>
+        <w:t>• PDF and HTML report generation</w:t>
+        <w:br/>
+        <w:t>• Scheduled automated security scans</w:t>
+        <w:br/>
+        <w:t>• Multi-host network scanning support</w:t>
       </w:r>
     </w:p>
     <w:sectPr>

</xml_diff>

<commit_message>
Day 12: Integrating independent modules into a single workflow
</commit_message>
<xml_diff>
--- a/sentinal/research/report/output/SentinelAI_Report.docx
+++ b/sentinal/research/report/output/SentinelAI_Report.docx
@@ -37,7 +37,7 @@
     </w:p>
     <w:p>
       <w:r>
-        <w:t>Date: 02 August 2026, 11:12 AM</w:t>
+        <w:t>Date: 02 August 2026, 11:37 AM</w:t>
       </w:r>
     </w:p>
     <w:p>
@@ -109,7 +109,7 @@
           </w:tcPr>
           <w:p>
             <w:r>
-              <w:t>22</w:t>
+              <w:t>80</w:t>
             </w:r>
           </w:p>
         </w:tc>
@@ -119,7 +119,7 @@
           </w:tcPr>
           <w:p>
             <w:r>
-              <w:t>SSH</w:t>
+              <w:t>Apache HTTP</w:t>
             </w:r>
           </w:p>
         </w:tc>
@@ -129,7 +129,7 @@
           </w:tcPr>
           <w:p>
             <w:r>
-              <w:t>Low</w:t>
+              <w:t>High</w:t>
             </w:r>
           </w:p>
         </w:tc>
@@ -139,7 +139,7 @@
           </w:tcPr>
           <w:p>
             <w:r>
-              <w:t>Open</w:t>
+              <w:t>Vulnerable</w:t>
             </w:r>
           </w:p>
         </w:tc>
@@ -161,7 +161,7 @@
           </w:tcPr>
           <w:p>
             <w:r>
-              <w:t>HTTP</w:t>
+              <w:t>Apache HTTP</w:t>
             </w:r>
           </w:p>
         </w:tc>
@@ -171,7 +171,7 @@
           </w:tcPr>
           <w:p>
             <w:r>
-              <w:t>Medium</w:t>
+              <w:t>Unknown</w:t>
             </w:r>
           </w:p>
         </w:tc>
@@ -181,7 +181,7 @@
           </w:tcPr>
           <w:p>
             <w:r>
-              <w:t>Open</w:t>
+              <w:t>Vulnerable</w:t>
             </w:r>
           </w:p>
         </w:tc>
@@ -193,7 +193,7 @@
           </w:tcPr>
           <w:p>
             <w:r>
-              <w:t>443</w:t>
+              <w:t>80</w:t>
             </w:r>
           </w:p>
         </w:tc>
@@ -203,7 +203,7 @@
           </w:tcPr>
           <w:p>
             <w:r>
-              <w:t>HTTPS</w:t>
+              <w:t>Apache HTTP</w:t>
             </w:r>
           </w:p>
         </w:tc>
@@ -213,7 +213,7 @@
           </w:tcPr>
           <w:p>
             <w:r>
-              <w:t>Low</w:t>
+              <w:t>Unknown</w:t>
             </w:r>
           </w:p>
         </w:tc>
@@ -223,7 +223,7 @@
           </w:tcPr>
           <w:p>
             <w:r>
-              <w:t>Open</w:t>
+              <w:t>Vulnerable</w:t>
             </w:r>
           </w:p>
         </w:tc>
@@ -235,7 +235,7 @@
           </w:tcPr>
           <w:p>
             <w:r>
-              <w:t>3389</w:t>
+              <w:t>80</w:t>
             </w:r>
           </w:p>
         </w:tc>
@@ -245,7 +245,7 @@
           </w:tcPr>
           <w:p>
             <w:r>
-              <w:t>RDP</w:t>
+              <w:t>Apache HTTP</w:t>
             </w:r>
           </w:p>
         </w:tc>
@@ -255,7 +255,7 @@
           </w:tcPr>
           <w:p>
             <w:r>
-              <w:t>High</w:t>
+              <w:t>Unknown</w:t>
             </w:r>
           </w:p>
         </w:tc>
@@ -265,7 +265,49 @@
           </w:tcPr>
           <w:p>
             <w:r>
-              <w:t>Open</w:t>
+              <w:t>Vulnerable</w:t>
+            </w:r>
+          </w:p>
+        </w:tc>
+      </w:tr>
+      <w:tr>
+        <w:tc>
+          <w:tcPr>
+            <w:tcW w:type="dxa" w:w="2160"/>
+          </w:tcPr>
+          <w:p>
+            <w:r>
+              <w:t>80</w:t>
+            </w:r>
+          </w:p>
+        </w:tc>
+        <w:tc>
+          <w:tcPr>
+            <w:tcW w:type="dxa" w:w="2160"/>
+          </w:tcPr>
+          <w:p>
+            <w:r>
+              <w:t>Apache HTTP</w:t>
+            </w:r>
+          </w:p>
+        </w:tc>
+        <w:tc>
+          <w:tcPr>
+            <w:tcW w:type="dxa" w:w="2160"/>
+          </w:tcPr>
+          <w:p>
+            <w:r>
+              <w:t>Unknown</w:t>
+            </w:r>
+          </w:p>
+        </w:tc>
+        <w:tc>
+          <w:tcPr>
+            <w:tcW w:type="dxa" w:w="2160"/>
+          </w:tcPr>
+          <w:p>
+            <w:r>
+              <w:t>Vulnerable</w:t>
             </w:r>
           </w:p>
         </w:tc>
@@ -281,7 +323,7 @@
     </w:p>
     <w:p>
       <w:r>
-        <w:t>This report presents the results of the security assessment performed on the target system (192.168.1.10) using the Nmap Basic Scan. During the scan, a total of 4 security findings were identified. The assessment detected 0 Critical, 1 High, 1 Medium, and 2 Low severity findings. Based on these results, it is recommended to review the identified services and implement the necessary security updates and remediation measures to reduce potential security risks.</w:t>
+        <w:t>This report presents the results of the security assessment performed on the target system (192.168.1.10) using the Nmap Basic Scan. During the scan, a total of 5 security findings were identified. The assessment detected 0 Critical, 1 High, 0 Medium, and 0 Low severity findings. Based on these results, it is recommended to review the identified services and implement the necessary security updates and remediation measures to reduce potential security risks.</w:t>
       </w:r>
     </w:p>
     <w:p/>
@@ -295,7 +337,7 @@
     </w:p>
     <w:p>
       <w:r>
-        <w:t>• Total Findings: 4</w:t>
+        <w:t>• Total Findings: 5</w:t>
         <w:br/>
       </w:r>
       <w:r>
@@ -307,11 +349,11 @@
         <w:br/>
       </w:r>
       <w:r>
-        <w:t>• Medium Severity: 1</w:t>
+        <w:t>• Medium Severity: 0</w:t>
         <w:br/>
       </w:r>
       <w:r>
-        <w:t>• Low Severity: 2</w:t>
+        <w:t>• Low Severity: 0</w:t>
       </w:r>
     </w:p>
     <w:p>

</xml_diff>

<commit_message>
Day 13: Added severity color coding to dynamic report
</commit_message>
<xml_diff>
--- a/sentinal/research/report/output/SentinelAI_Report.docx
+++ b/sentinal/research/report/output/SentinelAI_Report.docx
@@ -37,7 +37,7 @@
     </w:p>
     <w:p>
       <w:r>
-        <w:t>Date: 02 August 2026, 11:37 AM</w:t>
+        <w:t>Date: 03 August 2026, 02:47 PM</w:t>
       </w:r>
     </w:p>
     <w:p>
@@ -129,6 +129,9 @@
           </w:tcPr>
           <w:p>
             <w:r>
+              <w:rPr>
+                <w:color w:val="FF8C00"/>
+              </w:rPr>
               <w:t>High</w:t>
             </w:r>
           </w:p>
@@ -171,6 +174,9 @@
           </w:tcPr>
           <w:p>
             <w:r>
+              <w:rPr>
+                <w:color w:val="808080"/>
+              </w:rPr>
               <w:t>Unknown</w:t>
             </w:r>
           </w:p>
@@ -213,6 +219,9 @@
           </w:tcPr>
           <w:p>
             <w:r>
+              <w:rPr>
+                <w:color w:val="808080"/>
+              </w:rPr>
               <w:t>Unknown</w:t>
             </w:r>
           </w:p>
@@ -255,6 +264,9 @@
           </w:tcPr>
           <w:p>
             <w:r>
+              <w:rPr>
+                <w:color w:val="808080"/>
+              </w:rPr>
               <w:t>Unknown</w:t>
             </w:r>
           </w:p>
@@ -297,6 +309,9 @@
           </w:tcPr>
           <w:p>
             <w:r>
+              <w:rPr>
+                <w:color w:val="808080"/>
+              </w:rPr>
               <w:t>Unknown</w:t>
             </w:r>
           </w:p>

</xml_diff>

<commit_message>
Added Windows Event Log section to DOCX and PDF reports
</commit_message>
<xml_diff>
--- a/sentinal/research/report/output/SentinelAI_Report.docx
+++ b/sentinal/research/report/output/SentinelAI_Report.docx
@@ -37,7 +37,7 @@
     </w:p>
     <w:p>
       <w:r>
-        <w:t>Date: 03 August 2026, 02:47 PM</w:t>
+        <w:t>Date: 03 August 2026, 04:05 PM</w:t>
       </w:r>
     </w:p>
     <w:p>
@@ -323,6 +323,153 @@
           <w:p>
             <w:r>
               <w:t>Vulnerable</w:t>
+            </w:r>
+          </w:p>
+        </w:tc>
+      </w:tr>
+    </w:tbl>
+    <w:p>
+      <w:pPr>
+        <w:pStyle w:val="Heading2"/>
+      </w:pPr>
+      <w:r>
+        <w:t>Windows Event Logs</w:t>
+      </w:r>
+    </w:p>
+    <w:tbl>
+      <w:tblPr>
+        <w:tblStyle w:val="TableGrid"/>
+        <w:tblW w:type="auto" w:w="0"/>
+        <w:tblLook w:firstColumn="1" w:firstRow="1" w:lastColumn="0" w:lastRow="0" w:noHBand="0" w:noVBand="1" w:val="04A0"/>
+      </w:tblPr>
+      <w:tblGrid>
+        <w:gridCol w:w="2160"/>
+        <w:gridCol w:w="2160"/>
+        <w:gridCol w:w="2160"/>
+        <w:gridCol w:w="2160"/>
+      </w:tblGrid>
+      <w:tr>
+        <w:tc>
+          <w:tcPr>
+            <w:tcW w:type="dxa" w:w="2160"/>
+          </w:tcPr>
+          <w:p>
+            <w:r>
+              <w:t>Event ID</w:t>
+            </w:r>
+          </w:p>
+        </w:tc>
+        <w:tc>
+          <w:tcPr>
+            <w:tcW w:type="dxa" w:w="2160"/>
+          </w:tcPr>
+          <w:p>
+            <w:r>
+              <w:t>Time</w:t>
+            </w:r>
+          </w:p>
+        </w:tc>
+        <w:tc>
+          <w:tcPr>
+            <w:tcW w:type="dxa" w:w="2160"/>
+          </w:tcPr>
+          <w:p>
+            <w:r>
+              <w:t>User</w:t>
+            </w:r>
+          </w:p>
+        </w:tc>
+        <w:tc>
+          <w:tcPr>
+            <w:tcW w:type="dxa" w:w="2160"/>
+          </w:tcPr>
+          <w:p>
+            <w:r>
+              <w:t>Description</w:t>
+            </w:r>
+          </w:p>
+        </w:tc>
+      </w:tr>
+      <w:tr>
+        <w:tc>
+          <w:tcPr>
+            <w:tcW w:type="dxa" w:w="2160"/>
+          </w:tcPr>
+          <w:p>
+            <w:r>
+              <w:t>4625</w:t>
+            </w:r>
+          </w:p>
+        </w:tc>
+        <w:tc>
+          <w:tcPr>
+            <w:tcW w:type="dxa" w:w="2160"/>
+          </w:tcPr>
+          <w:p>
+            <w:r>
+              <w:t>02 August 2026, 11:15 AM</w:t>
+            </w:r>
+          </w:p>
+        </w:tc>
+        <w:tc>
+          <w:tcPr>
+            <w:tcW w:type="dxa" w:w="2160"/>
+          </w:tcPr>
+          <w:p>
+            <w:r>
+              <w:t>Administrator</w:t>
+            </w:r>
+          </w:p>
+        </w:tc>
+        <w:tc>
+          <w:tcPr>
+            <w:tcW w:type="dxa" w:w="2160"/>
+          </w:tcPr>
+          <w:p>
+            <w:r>
+              <w:t>Failed Login Attempt</w:t>
+            </w:r>
+          </w:p>
+        </w:tc>
+      </w:tr>
+      <w:tr>
+        <w:tc>
+          <w:tcPr>
+            <w:tcW w:type="dxa" w:w="2160"/>
+          </w:tcPr>
+          <w:p>
+            <w:r>
+              <w:t>4720</w:t>
+            </w:r>
+          </w:p>
+        </w:tc>
+        <w:tc>
+          <w:tcPr>
+            <w:tcW w:type="dxa" w:w="2160"/>
+          </w:tcPr>
+          <w:p>
+            <w:r>
+              <w:t>02 August 2026, 11:25 AM</w:t>
+            </w:r>
+          </w:p>
+        </w:tc>
+        <w:tc>
+          <w:tcPr>
+            <w:tcW w:type="dxa" w:w="2160"/>
+          </w:tcPr>
+          <w:p>
+            <w:r>
+              <w:t>John</w:t>
+            </w:r>
+          </w:p>
+        </w:tc>
+        <w:tc>
+          <w:tcPr>
+            <w:tcW w:type="dxa" w:w="2160"/>
+          </w:tcPr>
+          <w:p>
+            <w:r>
+              <w:t>New User Account Created</w:t>
             </w:r>
           </w:p>
         </w:tc>

</xml_diff>

<commit_message>
Added MITRE ATT&CK and OWASP mapping sections to DOCX report
</commit_message>
<xml_diff>
--- a/sentinal/research/report/output/SentinelAI_Report.docx
+++ b/sentinal/research/report/output/SentinelAI_Report.docx
@@ -37,7 +37,7 @@
     </w:p>
     <w:p>
       <w:r>
-        <w:t>Date: 03 August 2026, 04:05 PM</w:t>
+        <w:t>Date: 04 August 2026, 03:25 PM</w:t>
       </w:r>
     </w:p>
     <w:p>
@@ -475,6 +475,179 @@
         </w:tc>
       </w:tr>
     </w:tbl>
+    <w:p/>
+    <w:p>
+      <w:pPr>
+        <w:pStyle w:val="Heading2"/>
+      </w:pPr>
+      <w:r>
+        <w:t>MITRE ATT&amp;CK Mapping</w:t>
+      </w:r>
+    </w:p>
+    <w:tbl>
+      <w:tblPr>
+        <w:tblStyle w:val="TableGrid"/>
+        <w:tblW w:type="auto" w:w="0"/>
+        <w:tblLook w:firstColumn="1" w:firstRow="1" w:lastColumn="0" w:lastRow="0" w:noHBand="0" w:noVBand="1" w:val="04A0"/>
+      </w:tblPr>
+      <w:tblGrid>
+        <w:gridCol w:w="4320"/>
+        <w:gridCol w:w="4320"/>
+      </w:tblGrid>
+      <w:tr>
+        <w:tc>
+          <w:tcPr>
+            <w:tcW w:type="dxa" w:w="4320"/>
+          </w:tcPr>
+          <w:p>
+            <w:r>
+              <w:t>Technique ID</w:t>
+            </w:r>
+          </w:p>
+        </w:tc>
+        <w:tc>
+          <w:tcPr>
+            <w:tcW w:type="dxa" w:w="4320"/>
+          </w:tcPr>
+          <w:p>
+            <w:r>
+              <w:t>Technique Name</w:t>
+            </w:r>
+          </w:p>
+        </w:tc>
+      </w:tr>
+      <w:tr>
+        <w:tc>
+          <w:tcPr>
+            <w:tcW w:type="dxa" w:w="4320"/>
+          </w:tcPr>
+          <w:p>
+            <w:r>
+              <w:t>T1021</w:t>
+            </w:r>
+          </w:p>
+        </w:tc>
+        <w:tc>
+          <w:tcPr>
+            <w:tcW w:type="dxa" w:w="4320"/>
+          </w:tcPr>
+          <w:p>
+            <w:r>
+              <w:t>Remote Services</w:t>
+            </w:r>
+          </w:p>
+        </w:tc>
+      </w:tr>
+      <w:tr>
+        <w:tc>
+          <w:tcPr>
+            <w:tcW w:type="dxa" w:w="4320"/>
+          </w:tcPr>
+          <w:p>
+            <w:r>
+              <w:t>T1110</w:t>
+            </w:r>
+          </w:p>
+        </w:tc>
+        <w:tc>
+          <w:tcPr>
+            <w:tcW w:type="dxa" w:w="4320"/>
+          </w:tcPr>
+          <w:p>
+            <w:r>
+              <w:t>Brute Force</w:t>
+            </w:r>
+          </w:p>
+        </w:tc>
+      </w:tr>
+    </w:tbl>
+    <w:p/>
+    <w:p>
+      <w:pPr>
+        <w:pStyle w:val="Heading2"/>
+      </w:pPr>
+      <w:r>
+        <w:t>OWASP Top 10 Mapping</w:t>
+      </w:r>
+    </w:p>
+    <w:tbl>
+      <w:tblPr>
+        <w:tblStyle w:val="TableGrid"/>
+        <w:tblW w:type="auto" w:w="0"/>
+        <w:tblLook w:firstColumn="1" w:firstRow="1" w:lastColumn="0" w:lastRow="0" w:noHBand="0" w:noVBand="1" w:val="04A0"/>
+      </w:tblPr>
+      <w:tblGrid>
+        <w:gridCol w:w="4320"/>
+        <w:gridCol w:w="4320"/>
+      </w:tblGrid>
+      <w:tr>
+        <w:tc>
+          <w:tcPr>
+            <w:tcW w:type="dxa" w:w="4320"/>
+          </w:tcPr>
+          <w:p>
+            <w:r>
+              <w:t>Category</w:t>
+            </w:r>
+          </w:p>
+        </w:tc>
+        <w:tc>
+          <w:tcPr>
+            <w:tcW w:type="dxa" w:w="4320"/>
+          </w:tcPr>
+          <w:p>
+            <w:r>
+              <w:t>OWASP Vulnerability</w:t>
+            </w:r>
+          </w:p>
+        </w:tc>
+      </w:tr>
+      <w:tr>
+        <w:tc>
+          <w:tcPr>
+            <w:tcW w:type="dxa" w:w="4320"/>
+          </w:tcPr>
+          <w:p>
+            <w:r>
+              <w:t>A06</w:t>
+            </w:r>
+          </w:p>
+        </w:tc>
+        <w:tc>
+          <w:tcPr>
+            <w:tcW w:type="dxa" w:w="4320"/>
+          </w:tcPr>
+          <w:p>
+            <w:r>
+              <w:t>Vulnerable and Outdated Components</w:t>
+            </w:r>
+          </w:p>
+        </w:tc>
+      </w:tr>
+      <w:tr>
+        <w:tc>
+          <w:tcPr>
+            <w:tcW w:type="dxa" w:w="4320"/>
+          </w:tcPr>
+          <w:p>
+            <w:r>
+              <w:t>A07</w:t>
+            </w:r>
+          </w:p>
+        </w:tc>
+        <w:tc>
+          <w:tcPr>
+            <w:tcW w:type="dxa" w:w="4320"/>
+          </w:tcPr>
+          <w:p>
+            <w:r>
+              <w:t>Identification and Authentication Failures</w:t>
+            </w:r>
+          </w:p>
+        </w:tc>
+      </w:tr>
+    </w:tbl>
+    <w:p/>
     <w:p>
       <w:pPr>
         <w:pStyle w:val="Heading2"/>

</xml_diff>

<commit_message>
Day 17 - Added Remediation Steps section to DOCX report
</commit_message>
<xml_diff>
--- a/sentinal/research/report/output/SentinelAI_Report.docx
+++ b/sentinal/research/report/output/SentinelAI_Report.docx
@@ -37,7 +37,7 @@
     </w:p>
     <w:p>
       <w:r>
-        <w:t>Date: 04 August 2026, 03:25 PM</w:t>
+        <w:t>Date: 04 August 2026, 03:52 PM</w:t>
       </w:r>
     </w:p>
     <w:p>
@@ -653,6 +653,96 @@
         <w:pStyle w:val="Heading2"/>
       </w:pPr>
       <w:r>
+        <w:t>Remediation Steps</w:t>
+      </w:r>
+    </w:p>
+    <w:p>
+      <w:pPr>
+        <w:pStyle w:val="Heading3"/>
+      </w:pPr>
+      <w:r>
+        <w:t>Apache HTTP Server (High Severity)</w:t>
+      </w:r>
+    </w:p>
+    <w:p>
+      <w:pPr>
+        <w:pStyle w:val="ListBullet"/>
+      </w:pPr>
+      <w:r>
+        <w:t>Update Apache to the latest stable version.</w:t>
+      </w:r>
+    </w:p>
+    <w:p>
+      <w:pPr>
+        <w:pStyle w:val="ListBullet"/>
+      </w:pPr>
+      <w:r>
+        <w:t>Apply all available security patches.</w:t>
+      </w:r>
+    </w:p>
+    <w:p>
+      <w:pPr>
+        <w:pStyle w:val="ListBullet"/>
+      </w:pPr>
+      <w:r>
+        <w:t>Disable unnecessary Apache modules.</w:t>
+      </w:r>
+    </w:p>
+    <w:p>
+      <w:pPr>
+        <w:pStyle w:val="ListBullet"/>
+      </w:pPr>
+      <w:r>
+        <w:t>Enable HTTPS using a valid TLS certificate.</w:t>
+      </w:r>
+    </w:p>
+    <w:p/>
+    <w:p>
+      <w:pPr>
+        <w:pStyle w:val="Heading3"/>
+      </w:pPr>
+      <w:r>
+        <w:t>Failed Login Attempts (Medium Severity)</w:t>
+      </w:r>
+    </w:p>
+    <w:p>
+      <w:pPr>
+        <w:pStyle w:val="ListBullet"/>
+      </w:pPr>
+      <w:r>
+        <w:t>Review failed login attempts.</w:t>
+      </w:r>
+    </w:p>
+    <w:p>
+      <w:pPr>
+        <w:pStyle w:val="ListBullet"/>
+      </w:pPr>
+      <w:r>
+        <w:t>Enable account lockout policy.</w:t>
+      </w:r>
+    </w:p>
+    <w:p>
+      <w:pPr>
+        <w:pStyle w:val="ListBullet"/>
+      </w:pPr>
+      <w:r>
+        <w:t>Use strong passwords.</w:t>
+      </w:r>
+    </w:p>
+    <w:p>
+      <w:pPr>
+        <w:pStyle w:val="ListBullet"/>
+      </w:pPr>
+      <w:r>
+        <w:t>Enable Multi-Factor Authentication (MFA).</w:t>
+      </w:r>
+    </w:p>
+    <w:p/>
+    <w:p>
+      <w:pPr>
+        <w:pStyle w:val="Heading2"/>
+      </w:pPr>
+      <w:r>
         <w:t>Summary</w:t>
       </w:r>
     </w:p>

</xml_diff>

<commit_message>
Day 21 Add automatic executive summary to DOCX, PDF and Markdown reports
</commit_message>
<xml_diff>
--- a/sentinal/research/report/output/SentinelAI_Report.docx
+++ b/sentinal/research/report/output/SentinelAI_Report.docx
@@ -12,6 +12,19 @@
       </w:r>
     </w:p>
     <w:p/>
+    <w:p>
+      <w:pPr>
+        <w:pStyle w:val="Heading1"/>
+      </w:pPr>
+      <w:r>
+        <w:t>Executive Summary</w:t>
+      </w:r>
+    </w:p>
+    <w:p>
+      <w:r>
+        <w:t>SentinelAI analyzed the target system (192.168.1.10) and identified 5 security findings. These include 0 Critical, 1 High, 0 Medium, and 0 Low severity issues. Known vulnerabilities were correlated with the NVD database where applicable. Priority remediation is recommended for Critical and High findings.</w:t>
+      </w:r>
+    </w:p>
     <w:p>
       <w:pPr>
         <w:pStyle w:val="Heading2"/>
@@ -37,7 +50,7 @@
     </w:p>
     <w:p>
       <w:r>
-        <w:t>Date: 11 August 2026, 12:17 PM</w:t>
+        <w:t>Date: 17 August 2026, 01:09 PM</w:t>
       </w:r>
     </w:p>
     <w:p>

</xml_diff>